<commit_message>
docs(fde-kt): align FDE playbook with platform truth
Replace playbook_overlays.json with customer_playbooks, correct Qdrant
indexing timing, dc2_s/saas_premium verticals, and EC2 acceptance sign-off.

Co-authored-by: Cursor <cursoragent@cursor.com>
</commit_message>
<xml_diff>
--- a/gtm-decks/fde-kt/CSPulse_FDE_Playbook.docx
+++ b/gtm-decks/fde-kt/CSPulse_FDE_Playbook.docx
@@ -1940,7 +1940,7 @@
                 <w:sz w:val="20"/>
                 <w:szCs w:val="20"/>
               </w:rPr>
-              <w:t xml:space="preserve">Vertical-specific KPI catalogs, pillar weights, and overlays. Default verticals: DC2_S (data center hardware), SaaS Premium, Healthcare Provider.</w:t>
+              <w:t xml:space="preserve">Vertical-specific KPI catalogs, pillar weights, and overlays. First-class verticals today: dc2_s (data center) and saas_premium. Other industries (e.g. healthcare) are account firmographics, not separate vertical modules.</w:t>
             </w:r>
           </w:p>
         </w:tc>
@@ -4312,7 +4312,7 @@
                 <w:sz w:val="20"/>
                 <w:szCs w:val="20"/>
               </w:rPr>
-              <w:t xml:space="preserve">Semantic search over qualitative signals. SignalVectorStore (utils/qdrant_signal_search.py) embeds and stores; signal_engine/enrichment.py and utils/signal_analyst.py read it. Powers the search_signals MCP tool.</w:t>
+              <w:t xml:space="preserve">Semantic search over qualitative signals. SignalVectorStore (utils/qdrant_signal_search.py): signal_engine/enrichment.py searches similar past signals during live enrichment; utils/signal_analyst.py uses the same store. Bulk (re)index via index_signals() runs after process_data when QDRANT_URL is set (optional pipeline stage). Powers search_signals MCP.</w:t>
             </w:r>
           </w:p>
         </w:tc>
@@ -4341,7 +4341,7 @@
                 <w:sz w:val="20"/>
                 <w:szCs w:val="20"/>
               </w:rPr>
-              <w:t xml:space="preserve">On every signal write when QDRANT_URL + QDRANT_API_KEY are set on EC2. If env vars are missing the system runs without semantic search and falls back to keyword matching.</w:t>
+              <w:t xml:space="preserve">When QDRANT_URL + QDRANT_API_KEY are set: search at enrich-time; bulk reindex after process_data or material upload. If unset, falls back to SQL/keyword matching.</w:t>
             </w:r>
           </w:p>
         </w:tc>
@@ -5752,7 +5752,7 @@
         <w:spacing w:after="80"/>
       </w:pPr>
       <w:r>
-        <w:t xml:space="preserve">config/playbook_overlays.json — customer-specific playbook templates.</w:t>
+        <w:t xml:space="preserve">Per-tenant playbooks — customer_playbooks DB table via /api/playbooks/library (customer_playbook_api.py). See §2.5; there is no config/playbook_overlays.json file.</w:t>
       </w:r>
     </w:p>
     <w:p>
@@ -5765,7 +5765,7 @@
         <w:spacing w:after="80"/>
       </w:pPr>
       <w:r>
-        <w:t xml:space="preserve">config/signal_channels.json — Slack channels, email aliases, transcript sources.</w:t>
+        <w:t xml:space="preserve">config/signal_channels.json — Slack channels, email aliases, transcript sources (live signal engine only).</w:t>
       </w:r>
     </w:p>
     <w:p>
@@ -8555,7 +8555,7 @@
                 <w:sz w:val="20"/>
                 <w:szCs w:val="20"/>
               </w:rPr>
-              <w:t xml:space="preserve">Pure customer-specific config: weights, signal channels, playbook templates. Lives in verticals/customer{N}-*/. Does not touch shared code.</w:t>
+              <w:t xml:space="preserve">Pure customer-specific config: weights, signal_channels.json, customer_playbooks rows (/api/playbooks/library). Lives in verticals/customer{N}-*/. Does not touch shared code.</w:t>
             </w:r>
           </w:p>
         </w:tc>
@@ -10775,7 +10775,7 @@
                 <w:sz w:val="20"/>
                 <w:szCs w:val="20"/>
               </w:rPr>
-              <w:t xml:space="preserve">Persona grader runner</w:t>
+              <w:t xml:space="preserve">Per-tenant playbooks (DB)</w:t>
             </w:r>
           </w:p>
         </w:tc>
@@ -10804,7 +10804,7 @@
                 <w:sz w:val="20"/>
                 <w:szCs w:val="20"/>
               </w:rPr>
-              <w:t xml:space="preserve">kpi-dashboard/backend/tests/persona_grading/runner.py (invoke via python3 -m tests.persona_grading.runner)</w:t>
+              <w:t xml:space="preserve">customer_playbooks table — /api/playbooks/library (see customer_playbook_api.py)</w:t>
             </w:r>
           </w:p>
         </w:tc>
@@ -10839,7 +10839,7 @@
                 <w:sz w:val="20"/>
                 <w:szCs w:val="20"/>
               </w:rPr>
-              <w:t xml:space="preserve">Acceptance harness (primary)</w:t>
+              <w:t xml:space="preserve">Persona grader runner</w:t>
             </w:r>
           </w:p>
         </w:tc>
@@ -10869,7 +10869,7 @@
                 <w:sz w:val="20"/>
                 <w:szCs w:val="20"/>
               </w:rPr>
-              <w:t xml:space="preserve">scripts/run_acceptance_ec2.sh + scripts/.env.acceptance(.example) + scripts/ec2_acceptance/{config,http_client,checks}.py</w:t>
+              <w:t xml:space="preserve">kpi-dashboard/backend/tests/persona_grading/runner.py (invoke via python3 -m tests.persona_grading.runner)</w:t>
             </w:r>
           </w:p>
         </w:tc>
@@ -10903,7 +10903,7 @@
                 <w:sz w:val="20"/>
                 <w:szCs w:val="20"/>
               </w:rPr>
-              <w:t xml:space="preserve">HTTP verify — env-driven multi-suite</w:t>
+              <w:t xml:space="preserve">Acceptance harness (primary)</w:t>
             </w:r>
           </w:p>
         </w:tc>
@@ -10932,7 +10932,7 @@
                 <w:sz w:val="20"/>
                 <w:szCs w:val="20"/>
               </w:rPr>
-              <w:t xml:space="preserve">scripts/verify_executive_phases_ec2.py --suite all|cfo|cro|vpcs|cfo-phase1</w:t>
+              <w:t xml:space="preserve">scripts/run_acceptance_ec2.sh + scripts/.env.acceptance(.example) + scripts/ec2_acceptance/{config,http_client,checks}.py</w:t>
             </w:r>
           </w:p>
         </w:tc>
@@ -10967,7 +10967,7 @@
                 <w:sz w:val="20"/>
                 <w:szCs w:val="20"/>
               </w:rPr>
-              <w:t xml:space="preserve">HTTP verify — per-PR scripts (kept for surgical re-runs)</w:t>
+              <w:t xml:space="preserve">HTTP verify — env-driven multi-suite</w:t>
             </w:r>
           </w:p>
         </w:tc>
@@ -10997,7 +10997,7 @@
                 <w:sz w:val="20"/>
                 <w:szCs w:val="20"/>
               </w:rPr>
-              <w:t xml:space="preserve">scripts/verify_cfo_phases_ec2.py, verify_cro_phases_ec2.py, verify_vpcs_phases_ec2.py, verify_cfo_phase1_ec2.py</w:t>
+              <w:t xml:space="preserve">scripts/verify_executive_phases_ec2.py --suite all|cfo|cro|vpcs|cfo-phase1</w:t>
             </w:r>
           </w:p>
         </w:tc>
@@ -11031,7 +11031,7 @@
                 <w:sz w:val="20"/>
                 <w:szCs w:val="20"/>
               </w:rPr>
-              <w:t xml:space="preserve">Legacy numeric-snapshot harness (cust 333 only, NOT persona)</w:t>
+              <w:t xml:space="preserve">HTTP verify — per-PR scripts (kept for surgical re-runs)</w:t>
             </w:r>
           </w:p>
         </w:tc>
@@ -11060,7 +11060,7 @@
                 <w:sz w:val="20"/>
                 <w:szCs w:val="20"/>
               </w:rPr>
-              <w:t xml:space="preserve">scripts/sanity_check_cust333.py</w:t>
+              <w:t xml:space="preserve">scripts/verify_cfo_phases_ec2.py, verify_cro_phases_ec2.py, verify_vpcs_phases_ec2.py, verify_cfo_phase1_ec2.py</w:t>
             </w:r>
           </w:p>
         </w:tc>
@@ -11095,7 +11095,7 @@
                 <w:sz w:val="20"/>
                 <w:szCs w:val="20"/>
               </w:rPr>
-              <w:t xml:space="preserve">Deploy scripts</w:t>
+              <w:t xml:space="preserve">Legacy numeric-snapshot harness (cust 333 only, NOT persona)</w:t>
             </w:r>
           </w:p>
         </w:tc>
@@ -11125,7 +11125,7 @@
                 <w:sz w:val="20"/>
                 <w:szCs w:val="20"/>
               </w:rPr>
-              <w:t xml:space="preserve">scripts/deploy-ec2-git-pull.sh (primary), scripts/rehydrate-ec2-ecr.sh (ECR tag-based)</w:t>
+              <w:t xml:space="preserve">scripts/sanity_check_cust333.py</w:t>
             </w:r>
           </w:p>
         </w:tc>
@@ -11159,7 +11159,7 @@
                 <w:sz w:val="20"/>
                 <w:szCs w:val="20"/>
               </w:rPr>
-              <w:t xml:space="preserve">Docker compose (local)</w:t>
+              <w:t xml:space="preserve">Deploy scripts</w:t>
             </w:r>
           </w:p>
         </w:tc>
@@ -11188,7 +11188,7 @@
                 <w:sz w:val="20"/>
                 <w:szCs w:val="20"/>
               </w:rPr>
-              <w:t xml:space="preserve">docker-compose.cspulse.yml</w:t>
+              <w:t xml:space="preserve">scripts/deploy-ec2-git-pull.sh (primary), scripts/rehydrate-ec2-ecr.sh (ECR tag-based)</w:t>
             </w:r>
           </w:p>
         </w:tc>
@@ -11223,7 +11223,7 @@
                 <w:sz w:val="20"/>
                 <w:szCs w:val="20"/>
               </w:rPr>
-              <w:t xml:space="preserve">MCP tool catalog (~52 @mcp.tool decorators today)</w:t>
+              <w:t xml:space="preserve">Docker compose (local)</w:t>
             </w:r>
           </w:p>
         </w:tc>
@@ -11253,7 +11253,7 @@
                 <w:sz w:val="20"/>
                 <w:szCs w:val="20"/>
               </w:rPr>
-              <w:t xml:space="preserve">kpi-dashboard/backend/mcp_server/cs_pulse_*.py</w:t>
+              <w:t xml:space="preserve">docker-compose.cspulse.yml</w:t>
             </w:r>
           </w:p>
         </w:tc>
@@ -11287,6 +11287,70 @@
                 <w:sz w:val="20"/>
                 <w:szCs w:val="20"/>
               </w:rPr>
+              <w:t xml:space="preserve">MCP tool catalog (~52 @mcp.tool decorators today)</w:t>
+            </w:r>
+          </w:p>
+        </w:tc>
+        <w:tc>
+          <w:tcPr>
+            <w:tcW w:type="dxa" w:w="4800"/>
+            <w:tcBorders>
+              <w:top w:val="single" w:color="B8B8B8" w:sz="4"/>
+              <w:left w:val="single" w:color="B8B8B8" w:sz="4"/>
+              <w:bottom w:val="single" w:color="B8B8B8" w:sz="4"/>
+              <w:right w:val="single" w:color="B8B8B8" w:sz="4"/>
+            </w:tcBorders>
+            <w:tcMar>
+              <w:top w:type="dxa" w:w="100"/>
+              <w:left w:type="dxa" w:w="140"/>
+              <w:bottom w:type="dxa" w:w="100"/>
+              <w:right w:type="dxa" w:w="140"/>
+            </w:tcMar>
+          </w:tcPr>
+          <w:p>
+            <w:r>
+              <w:rPr>
+                <w:b w:val="false"/>
+                <w:bCs w:val="false"/>
+                <w:color w:val="000000"/>
+                <w:sz w:val="20"/>
+                <w:szCs w:val="20"/>
+              </w:rPr>
+              <w:t xml:space="preserve">kpi-dashboard/backend/mcp_server/cs_pulse_*.py</w:t>
+            </w:r>
+          </w:p>
+        </w:tc>
+      </w:tr>
+      <w:tr>
+        <w:trPr>
+          <w:tblHeader w:val="false"/>
+        </w:trPr>
+        <w:tc>
+          <w:tcPr>
+            <w:tcW w:type="dxa" w:w="4800"/>
+            <w:tcBorders>
+              <w:top w:val="single" w:color="B8B8B8" w:sz="4"/>
+              <w:left w:val="single" w:color="B8B8B8" w:sz="4"/>
+              <w:bottom w:val="single" w:color="B8B8B8" w:sz="4"/>
+              <w:right w:val="single" w:color="B8B8B8" w:sz="4"/>
+            </w:tcBorders>
+            <w:shd w:fill="F2F2F2" w:color="auto" w:val="clear"/>
+            <w:tcMar>
+              <w:top w:type="dxa" w:w="100"/>
+              <w:left w:type="dxa" w:w="140"/>
+              <w:bottom w:type="dxa" w:w="100"/>
+              <w:right w:type="dxa" w:w="140"/>
+            </w:tcMar>
+          </w:tcPr>
+          <w:p>
+            <w:r>
+              <w:rPr>
+                <w:b w:val="false"/>
+                <w:bCs w:val="false"/>
+                <w:color w:val="000000"/>
+                <w:sz w:val="20"/>
+                <w:szCs w:val="20"/>
+              </w:rPr>
               <w:t xml:space="preserve">Discovery workbook (this engagement)</w:t>
             </w:r>
           </w:p>
@@ -11300,6 +11364,7 @@
               <w:bottom w:val="single" w:color="B8B8B8" w:sz="4"/>
               <w:right w:val="single" w:color="B8B8B8" w:sz="4"/>
             </w:tcBorders>
+            <w:shd w:fill="F2F2F2" w:color="auto" w:val="clear"/>
             <w:tcMar>
               <w:top w:type="dxa" w:w="100"/>
               <w:left w:type="dxa" w:w="140"/>
@@ -12277,7 +12342,7 @@
         <w:spacing w:after="80"/>
       </w:pPr>
       <w:r>
-        <w:t xml:space="preserve">All five personas pass the eval matrix at threshold.</w:t>
+        <w:t xml:space="preserve">./scripts/run_acceptance_ec2.sh exits 0 (HTTP suites). If persona grading ran: all personas at customer bar (e.g. ACCEPTANCE_MIN_GRADE_NUMERIC=3.7 for A-).</w:t>
       </w:r>
     </w:p>
     <w:p>
@@ -12290,7 +12355,7 @@
         <w:spacing w:after="80"/>
       </w:pPr>
       <w:r>
-        <w:t xml:space="preserve">Golden sanity files committed to the customer overlay.</w:t>
+        <w:t xml:space="preserve">Persona grader JSON + HTTP verify baselines archived in the customer engagement folder (not necessarily in git — no secrets).</w:t>
       </w:r>
     </w:p>
     <w:p>

</xml_diff>